<commit_message>
Various fixes and improvements.
</commit_message>
<xml_diff>
--- a/src/main/resources/reportTemplates/phdLibraryReport.docx
+++ b/src/main/resources/reportTemplates/phdLibraryReport.docx
@@ -37,18 +37,22 @@
         <w:tblLook w:val="0600"/>
       </w:tblPr>
       <w:tblGrid>
-        <w:gridCol w:w="1201"/>
-        <w:gridCol w:w="1630"/>
-        <w:gridCol w:w="1502"/>
-        <w:gridCol w:w="1676"/>
-        <w:gridCol w:w="1676"/>
-        <w:gridCol w:w="1674"/>
+        <w:gridCol w:w="1260"/>
+        <w:gridCol w:w="1080"/>
+        <w:gridCol w:w="810"/>
+        <w:gridCol w:w="900"/>
+        <w:gridCol w:w="810"/>
+        <w:gridCol w:w="990"/>
+        <w:gridCol w:w="900"/>
+        <w:gridCol w:w="900"/>
+        <w:gridCol w:w="810"/>
+        <w:gridCol w:w="899"/>
       </w:tblGrid>
       <w:tr>
         <w:trPr/>
         <w:tc>
           <w:tcPr>
-            <w:tcW w:w="1201" w:type="dxa"/>
+            <w:tcW w:w="1260" w:type="dxa"/>
             <w:tcBorders>
               <w:top w:val="single" w:sz="8" w:space="0" w:color="000000"/>
               <w:left w:val="single" w:sz="8" w:space="0" w:color="000000"/>
@@ -77,7 +81,7 @@
         </w:tc>
         <w:tc>
           <w:tcPr>
-            <w:tcW w:w="1630" w:type="dxa"/>
+            <w:tcW w:w="1080" w:type="dxa"/>
             <w:tcBorders>
               <w:top w:val="single" w:sz="8" w:space="0" w:color="000000"/>
               <w:left w:val="single" w:sz="8" w:space="0" w:color="000000"/>
@@ -108,7 +112,7 @@
         </w:tc>
         <w:tc>
           <w:tcPr>
-            <w:tcW w:w="1502" w:type="dxa"/>
+            <w:tcW w:w="810" w:type="dxa"/>
             <w:tcBorders>
               <w:top w:val="single" w:sz="8" w:space="0" w:color="000000"/>
               <w:left w:val="single" w:sz="8" w:space="0" w:color="000000"/>
@@ -139,7 +143,7 @@
         </w:tc>
         <w:tc>
           <w:tcPr>
-            <w:tcW w:w="1676" w:type="dxa"/>
+            <w:tcW w:w="900" w:type="dxa"/>
             <w:tcBorders>
               <w:top w:val="single" w:sz="8" w:space="0" w:color="000000"/>
               <w:left w:val="single" w:sz="8" w:space="0" w:color="000000"/>
@@ -169,7 +173,7 @@
         </w:tc>
         <w:tc>
           <w:tcPr>
-            <w:tcW w:w="1676" w:type="dxa"/>
+            <w:tcW w:w="810" w:type="dxa"/>
             <w:tcBorders>
               <w:top w:val="single" w:sz="8" w:space="0" w:color="000000"/>
               <w:left w:val="single" w:sz="8" w:space="0" w:color="000000"/>
@@ -191,7 +195,119 @@
         </w:tc>
         <w:tc>
           <w:tcPr>
-            <w:tcW w:w="1674" w:type="dxa"/>
+            <w:tcW w:w="990" w:type="dxa"/>
+            <w:tcBorders>
+              <w:top w:val="single" w:sz="8" w:space="0" w:color="000000"/>
+              <w:left w:val="single" w:sz="8" w:space="0" w:color="000000"/>
+              <w:bottom w:val="single" w:sz="8" w:space="0" w:color="000000"/>
+            </w:tcBorders>
+            <w:shd w:fill="auto" w:val="clear"/>
+          </w:tcPr>
+          <w:p>
+            <w:pPr>
+              <w:pStyle w:val="Normal"/>
+              <w:widowControl w:val="false"/>
+              <w:rPr/>
+            </w:pPr>
+            <w:r>
+              <w:rPr/>
+              <w:t>{col6}</w:t>
+            </w:r>
+          </w:p>
+        </w:tc>
+        <w:tc>
+          <w:tcPr>
+            <w:tcW w:w="900" w:type="dxa"/>
+            <w:tcBorders>
+              <w:top w:val="single" w:sz="8" w:space="0" w:color="000000"/>
+              <w:left w:val="single" w:sz="8" w:space="0" w:color="000000"/>
+              <w:bottom w:val="single" w:sz="8" w:space="0" w:color="000000"/>
+            </w:tcBorders>
+            <w:shd w:fill="auto" w:val="clear"/>
+          </w:tcPr>
+          <w:p>
+            <w:pPr>
+              <w:pStyle w:val="Normal"/>
+              <w:widowControl w:val="false"/>
+              <w:rPr/>
+            </w:pPr>
+            <w:r>
+              <w:rPr/>
+              <w:t>{col</w:t>
+            </w:r>
+            <w:r>
+              <w:rPr/>
+              <w:t>7</w:t>
+            </w:r>
+            <w:r>
+              <w:rPr/>
+              <w:t>}</w:t>
+            </w:r>
+          </w:p>
+        </w:tc>
+        <w:tc>
+          <w:tcPr>
+            <w:tcW w:w="900" w:type="dxa"/>
+            <w:tcBorders>
+              <w:top w:val="single" w:sz="8" w:space="0" w:color="000000"/>
+              <w:left w:val="single" w:sz="8" w:space="0" w:color="000000"/>
+              <w:bottom w:val="single" w:sz="8" w:space="0" w:color="000000"/>
+            </w:tcBorders>
+            <w:shd w:fill="auto" w:val="clear"/>
+          </w:tcPr>
+          <w:p>
+            <w:pPr>
+              <w:pStyle w:val="Normal"/>
+              <w:widowControl w:val="false"/>
+              <w:rPr/>
+            </w:pPr>
+            <w:r>
+              <w:rPr/>
+              <w:t>{col</w:t>
+            </w:r>
+            <w:r>
+              <w:rPr/>
+              <w:t>8</w:t>
+            </w:r>
+            <w:r>
+              <w:rPr/>
+              <w:t>}</w:t>
+            </w:r>
+          </w:p>
+        </w:tc>
+        <w:tc>
+          <w:tcPr>
+            <w:tcW w:w="810" w:type="dxa"/>
+            <w:tcBorders>
+              <w:top w:val="single" w:sz="8" w:space="0" w:color="000000"/>
+              <w:left w:val="single" w:sz="8" w:space="0" w:color="000000"/>
+              <w:bottom w:val="single" w:sz="8" w:space="0" w:color="000000"/>
+            </w:tcBorders>
+            <w:shd w:fill="auto" w:val="clear"/>
+          </w:tcPr>
+          <w:p>
+            <w:pPr>
+              <w:pStyle w:val="Normal"/>
+              <w:widowControl w:val="false"/>
+              <w:rPr/>
+            </w:pPr>
+            <w:r>
+              <w:rPr/>
+              <w:t>{col</w:t>
+            </w:r>
+            <w:r>
+              <w:rPr/>
+              <w:t>9</w:t>
+            </w:r>
+            <w:r>
+              <w:rPr/>
+              <w:t>}</w:t>
+            </w:r>
+          </w:p>
+        </w:tc>
+        <w:tc>
+          <w:tcPr>
+            <w:tcW w:w="899" w:type="dxa"/>
             <w:tcBorders>
               <w:top w:val="single" w:sz="8" w:space="0" w:color="000000"/>
               <w:left w:val="single" w:sz="8" w:space="0" w:color="000000"/>
@@ -208,7 +324,15 @@
             </w:pPr>
             <w:r>
               <w:rPr/>
-              <w:t>{col6}</w:t>
+              <w:t>{col</w:t>
+            </w:r>
+            <w:r>
+              <w:rPr/>
+              <w:t>10</w:t>
+            </w:r>
+            <w:r>
+              <w:rPr/>
+              <w:t>}</w:t>
             </w:r>
           </w:p>
         </w:tc>

</xml_diff>